<commit_message>
Batch 6: Ma 19 + Joey 19 - cross-references added
</commit_message>
<xml_diff>
--- a/stories/docx/Joey 19.docx
+++ b/stories/docx/Joey 19.docx
@@ -79,7 +79,23 @@
         <w:pStyle w:val="BodyText"/>
       </w:pPr>
       <w:r>
-        <w:t xml:space="preserve">The Greek is going to make a move. I can feel it. He has never been patient, not really. He has always been the kind of man who takes what he wants when he wants it. And when he does, I am going to be ready.</w:t>
+        <w:t xml:space="preserve">The Greek is going to make a move. I can feel it. He has never been patient. He takes what he wants.</w:t>
+      </w:r>
+    </w:p>
+    <w:p>
+      <w:pPr>
+        <w:pStyle w:val="BodyText"/>
+      </w:pPr>
+      <w:r>
+        <w:t xml:space="preserve">I got a letter from Frank. War is getting worse. He mentioned something big coming — a mission. I could tell it was dangerous. I hope he stays safe. I have enough to worry about here.</w:t>
+      </w:r>
+    </w:p>
+    <w:p>
+      <w:pPr>
+        <w:pStyle w:val="BodyText"/>
+      </w:pPr>
+      <w:r>
+        <w:t xml:space="preserve">Stay sharp.</w:t>
       </w:r>
     </w:p>
     <w:p>

</xml_diff>